<commit_message>
docs(monetizácia): označiť prekonané termíny po zmrazení plateného štartu
Dokument o monetizácii hovoril, že infraštruktúra má byť hotová do
31. 12. 2026 a platená verzia spustená od 1. 1. 2027. Po piatich
prezentáciách a troch prihlásených obciach z 315 je platený štart zmrazený
a plán validácie hovorí, že sa nestavia nič — tie dve veci si protirečili
a niekto by podľa časti D mohol začať stavať účty a fakturáciu.

Pridaný rámček hneď na začiatku: termíny čakajú na rozhodnutie o novom
termíne (krok M1), samotný model — cenník, balík PLUS, limity, režim len na
čítanie — platí ďalej.

Dátumy v texte nemením, nový termín nie je rozhodnutý. Premietnutie
rozhodnutia je úloha M3.

Co-Authored-By: Claude Opus 5 <noreply@anthropic.com>
Claude-Session: https://claude.ai/code/session_01CRZZDpQGsSbMAugkAQ3q2M
</commit_message>
<xml_diff>
--- a/docs/VESMA_monetizacia_model.docx
+++ b/docs/VESMA_monetizacia_model.docx
@@ -223,6 +223,87 @@
           <w:sz w:val="19"/>
         </w:rPr>
         <w:t xml:space="preserve"> rozhovorom. Sľubuje, že základná verzia zostane bezplatná natrvalo — čo už neplatí. Neposielať ďalej; je tam len ako záznam východiskovej pozície.</w:t>
+      </w:r>
+    </w:p>
+    <w:p>
+      <w:pPr>
+        <w:spacing w:before="80" w:after="160"/>
+        <w:ind w:left="283"/>
+        <w:pBdr>
+          <w:left w:val="single" w:sz="18" w:space="8" w:color="52A8DE"/>
+        </w:pBdr>
+      </w:pPr>
+      <w:r>
+        <w:rPr>
+          <w:b/>
+          <w:sz w:val="19"/>
+        </w:rPr>
+        <w:t>Termíny v tomto dokumente sú prekonané (stav k 2. 10. 2026).</w:t>
+      </w:r>
+      <w:r>
+        <w:rPr>
+          <w:b w:val="0"/>
+          <w:sz w:val="19"/>
+        </w:rPr>
+        <w:t xml:space="preserve"> Po piatich prezentáciách sa prihlásili tri obce z 315, preto je </w:t>
+      </w:r>
+      <w:r>
+        <w:rPr>
+          <w:b/>
+          <w:sz w:val="19"/>
+        </w:rPr>
+        <w:t>platený štart zmrazený</w:t>
+      </w:r>
+      <w:r>
+        <w:rPr>
+          <w:b w:val="0"/>
+          <w:sz w:val="19"/>
+        </w:rPr>
+        <w:t xml:space="preserve">. Všetky dátumy v A.3 a v časti D — prechodné obdobie do 31. 12. 2026, platená verzia od 1. 1. 2027, infraštruktúra do konca roka — čakajú na rozhodnutie o novom termíne (krok M1 v </w:t>
+      </w:r>
+      <w:r>
+        <w:rPr>
+          <w:rFonts w:ascii="Consolas" w:hAnsi="Consolas"/>
+          <w:color w:val="5A5A5A"/>
+          <w:sz w:val="19"/>
+        </w:rPr>
+        <w:t>docs/validacia-dalsie-kroky.md</w:t>
+      </w:r>
+      <w:r>
+        <w:rPr>
+          <w:b w:val="0"/>
+          <w:sz w:val="19"/>
+        </w:rPr>
+        <w:t xml:space="preserve">). Do dovtedy sa </w:t>
+      </w:r>
+      <w:r>
+        <w:rPr>
+          <w:b/>
+          <w:sz w:val="19"/>
+        </w:rPr>
+        <w:t>nestavia databáza účtov, evidencia predplatného ani fakturácia</w:t>
+      </w:r>
+      <w:r>
+        <w:rPr>
+          <w:b w:val="0"/>
+          <w:sz w:val="19"/>
+        </w:rPr>
+        <w:t xml:space="preserve">. Samotný model — cenník, balík PLUS, limity, režim len na čítanie — platí ďalej. Stav validácie: </w:t>
+      </w:r>
+      <w:r>
+        <w:rPr>
+          <w:rFonts w:ascii="Consolas" w:hAnsi="Consolas"/>
+          <w:color w:val="5A5A5A"/>
+          <w:sz w:val="19"/>
+        </w:rPr>
+        <w:t>docs/kontext-monetizacia-a-validacia.md</w:t>
+      </w:r>
+      <w:r>
+        <w:rPr>
+          <w:b w:val="0"/>
+          <w:sz w:val="19"/>
+        </w:rPr>
+        <w:t>.</w:t>
       </w:r>
     </w:p>
     <w:p>
@@ -5220,6 +5301,27 @@
           <w:color w:val="5A5A5A"/>
           <w:sz w:val="18"/>
         </w:rPr>
+        <w:t>docs/kontext-monetizacia-a-validacia.md</w:t>
+      </w:r>
+      <w:r>
+        <w:rPr>
+          <w:b w:val="0"/>
+        </w:rPr>
+        <w:t xml:space="preserve"> — odovzdávací kontext: produkt, zadávateľka, model, stav validácie a otvorené rozhodnutia na jednom mieste.</w:t>
+      </w:r>
+    </w:p>
+    <w:p>
+      <w:pPr>
+        <w:pStyle w:val="ListBullet"/>
+        <w:spacing w:after="60"/>
+        <w:ind w:left="369"/>
+      </w:pPr>
+      <w:r>
+        <w:rPr>
+          <w:rFonts w:ascii="Consolas" w:hAnsi="Consolas"/>
+          <w:color w:val="5A5A5A"/>
+          <w:sz w:val="18"/>
+        </w:rPr>
         <w:t>docs/VESMA_monetizacia_podklad_pre_rozhovor_2026-09-04.docx</w:t>
       </w:r>
       <w:r>

</xml_diff>